<commit_message>
Tambah acara11, acara12, acara13, Bkpm dan laporan
</commit_message>
<xml_diff>
--- a/Hasil_Laporan_Nindi/LAPORAN_ACARA11_NINDIA TRI ANGGRAINI.docx
+++ b/Hasil_Laporan_Nindi/LAPORAN_ACARA11_NINDIA TRI ANGGRAINI.docx
@@ -1712,15 +1712,91 @@
         <w:jc w:val="both"/>
         <w:rPr>
           <w:rFonts w:ascii="Times New Roman" w:hAnsi="Times New Roman" w:cs="Times New Roman"/>
-          <w:lang w:val="sv-SE"/>
-        </w:rPr>
-      </w:pPr>
-      <w:r>
-        <w:rPr>
-          <w:rFonts w:ascii="Times New Roman" w:hAnsi="Times New Roman" w:cs="Times New Roman"/>
-          <w:lang w:val="sv-SE"/>
-        </w:rPr>
-        <w:t>Setelah conflict diperbaiki, perubahan dapat disimpan menggunakan:</w:t>
+        </w:rPr>
+      </w:pPr>
+      <w:proofErr w:type="spellStart"/>
+      <w:r>
+        <w:rPr>
+          <w:rFonts w:ascii="Times New Roman" w:hAnsi="Times New Roman" w:cs="Times New Roman"/>
+        </w:rPr>
+        <w:t>Setelah</w:t>
+      </w:r>
+      <w:proofErr w:type="spellEnd"/>
+      <w:r>
+        <w:rPr>
+          <w:rFonts w:ascii="Times New Roman" w:hAnsi="Times New Roman" w:cs="Times New Roman"/>
+        </w:rPr>
+        <w:t xml:space="preserve"> conflict </w:t>
+      </w:r>
+      <w:proofErr w:type="spellStart"/>
+      <w:r>
+        <w:rPr>
+          <w:rFonts w:ascii="Times New Roman" w:hAnsi="Times New Roman" w:cs="Times New Roman"/>
+        </w:rPr>
+        <w:t>diperbaiki</w:t>
+      </w:r>
+      <w:proofErr w:type="spellEnd"/>
+      <w:r>
+        <w:rPr>
+          <w:rFonts w:ascii="Times New Roman" w:hAnsi="Times New Roman" w:cs="Times New Roman"/>
+        </w:rPr>
+        <w:t xml:space="preserve">, </w:t>
+      </w:r>
+      <w:proofErr w:type="spellStart"/>
+      <w:r>
+        <w:rPr>
+          <w:rFonts w:ascii="Times New Roman" w:hAnsi="Times New Roman" w:cs="Times New Roman"/>
+        </w:rPr>
+        <w:t>perubahan</w:t>
+      </w:r>
+      <w:proofErr w:type="spellEnd"/>
+      <w:r>
+        <w:rPr>
+          <w:rFonts w:ascii="Times New Roman" w:hAnsi="Times New Roman" w:cs="Times New Roman"/>
+        </w:rPr>
+        <w:t xml:space="preserve"> </w:t>
+      </w:r>
+      <w:proofErr w:type="spellStart"/>
+      <w:r>
+        <w:rPr>
+          <w:rFonts w:ascii="Times New Roman" w:hAnsi="Times New Roman" w:cs="Times New Roman"/>
+        </w:rPr>
+        <w:t>dapat</w:t>
+      </w:r>
+      <w:proofErr w:type="spellEnd"/>
+      <w:r>
+        <w:rPr>
+          <w:rFonts w:ascii="Times New Roman" w:hAnsi="Times New Roman" w:cs="Times New Roman"/>
+        </w:rPr>
+        <w:t xml:space="preserve"> </w:t>
+      </w:r>
+      <w:proofErr w:type="spellStart"/>
+      <w:r>
+        <w:rPr>
+          <w:rFonts w:ascii="Times New Roman" w:hAnsi="Times New Roman" w:cs="Times New Roman"/>
+        </w:rPr>
+        <w:t>disimpan</w:t>
+      </w:r>
+      <w:proofErr w:type="spellEnd"/>
+      <w:r>
+        <w:rPr>
+          <w:rFonts w:ascii="Times New Roman" w:hAnsi="Times New Roman" w:cs="Times New Roman"/>
+        </w:rPr>
+        <w:t xml:space="preserve"> </w:t>
+      </w:r>
+      <w:proofErr w:type="spellStart"/>
+      <w:r>
+        <w:rPr>
+          <w:rFonts w:ascii="Times New Roman" w:hAnsi="Times New Roman" w:cs="Times New Roman"/>
+        </w:rPr>
+        <w:t>menggunakan</w:t>
+      </w:r>
+      <w:proofErr w:type="spellEnd"/>
+      <w:r>
+        <w:rPr>
+          <w:rFonts w:ascii="Times New Roman" w:hAnsi="Times New Roman" w:cs="Times New Roman"/>
+        </w:rPr>
+        <w:t>:</w:t>
       </w:r>
     </w:p>
     <w:p>
@@ -1731,7 +1807,6 @@
         <w:jc w:val="both"/>
         <w:rPr>
           <w:rFonts w:ascii="Times New Roman" w:hAnsi="Times New Roman" w:cs="Times New Roman"/>
-          <w:lang w:val="sv-SE"/>
         </w:rPr>
       </w:pPr>
     </w:p>
@@ -1743,13 +1818,11 @@
         <w:jc w:val="both"/>
         <w:rPr>
           <w:rFonts w:ascii="Times New Roman" w:hAnsi="Times New Roman" w:cs="Times New Roman"/>
-          <w:lang w:val="sv-SE"/>
-        </w:rPr>
-      </w:pPr>
-      <w:r>
-        <w:rPr>
-          <w:rFonts w:ascii="Times New Roman" w:hAnsi="Times New Roman" w:cs="Times New Roman"/>
-          <w:lang w:val="sv-SE"/>
+        </w:rPr>
+      </w:pPr>
+      <w:r>
+        <w:rPr>
+          <w:rFonts w:ascii="Times New Roman" w:hAnsi="Times New Roman" w:cs="Times New Roman"/>
         </w:rPr>
         <w:lastRenderedPageBreak/>
         <w:t>git add .</w:t>
@@ -2164,21 +2237,7 @@
         <w:rPr>
           <w:rFonts w:ascii="Times New Roman" w:hAnsi="Times New Roman" w:cs="Times New Roman"/>
         </w:rPr>
-        <w:t xml:space="preserve"> branch dan </w:t>
-      </w:r>
-      <w:proofErr w:type="gramStart"/>
-      <w:r>
-        <w:rPr>
-          <w:rFonts w:ascii="Times New Roman" w:hAnsi="Times New Roman" w:cs="Times New Roman"/>
-        </w:rPr>
-        <w:t>commit</w:t>
-      </w:r>
-      <w:proofErr w:type="gramEnd"/>
-      <w:r>
-        <w:rPr>
-          <w:rFonts w:ascii="Times New Roman" w:hAnsi="Times New Roman" w:cs="Times New Roman"/>
-        </w:rPr>
-        <w:t xml:space="preserve"> </w:t>
+        <w:t xml:space="preserve"> branch dan commit </w:t>
       </w:r>
       <w:proofErr w:type="spellStart"/>
       <w:r>
@@ -3055,7 +3114,7 @@
           <w:noProof/>
         </w:rPr>
         <w:drawing>
-          <wp:inline distT="0" distB="0" distL="0" distR="0" wp14:anchorId="6908A9D3" wp14:editId="2D58D6D7">
+          <wp:inline distT="0" distB="0" distL="0" distR="0" wp14:anchorId="6908A9D3" wp14:editId="7FBEE55C">
             <wp:extent cx="5731510" cy="1155065"/>
             <wp:effectExtent l="0" t="0" r="2540" b="6985"/>
             <wp:docPr id="1688221548" name="Picture 12"/>
@@ -3136,7 +3195,7 @@
           <w:noProof/>
         </w:rPr>
         <w:drawing>
-          <wp:inline distT="0" distB="0" distL="0" distR="0" wp14:anchorId="08B1708D" wp14:editId="05B289B0">
+          <wp:inline distT="0" distB="0" distL="0" distR="0" wp14:anchorId="08B1708D" wp14:editId="4591A6F5">
             <wp:extent cx="5731510" cy="1176655"/>
             <wp:effectExtent l="0" t="0" r="2540" b="4445"/>
             <wp:docPr id="452665545" name="Picture 13"/>
@@ -3234,7 +3293,7 @@
           <w:noProof/>
         </w:rPr>
         <w:drawing>
-          <wp:inline distT="0" distB="0" distL="0" distR="0" wp14:anchorId="5F85D1B7" wp14:editId="44A193DE">
+          <wp:inline distT="0" distB="0" distL="0" distR="0" wp14:anchorId="5F85D1B7" wp14:editId="43A5AAAE">
             <wp:extent cx="5731510" cy="2007870"/>
             <wp:effectExtent l="0" t="0" r="2540" b="0"/>
             <wp:docPr id="1329426158" name="Picture 14"/>
@@ -3511,16 +3570,6 @@
     </w:p>
     <w:p>
       <w:pPr>
-        <w:pStyle w:val="ListParagraph"/>
-        <w:spacing w:line="360" w:lineRule="auto"/>
-        <w:jc w:val="both"/>
-        <w:rPr>
-          <w:rFonts w:ascii="Times New Roman" w:hAnsi="Times New Roman" w:cs="Times New Roman"/>
-        </w:rPr>
-      </w:pPr>
-    </w:p>
-    <w:p>
-      <w:pPr>
         <w:pStyle w:val="NormalWeb"/>
         <w:ind w:left="567"/>
       </w:pPr>
@@ -3529,7 +3578,7 @@
           <w:noProof/>
         </w:rPr>
         <w:drawing>
-          <wp:inline distT="0" distB="0" distL="0" distR="0" wp14:anchorId="2E90960C" wp14:editId="7BF36CCB">
+          <wp:inline distT="0" distB="0" distL="0" distR="0" wp14:anchorId="2E90960C" wp14:editId="2BAA69B2">
             <wp:extent cx="5731510" cy="3372485"/>
             <wp:effectExtent l="0" t="0" r="2540" b="0"/>
             <wp:docPr id="1057160808" name="Picture 15"/>
@@ -3594,24 +3643,23 @@
     </w:p>
     <w:p>
       <w:pPr>
-        <w:spacing w:line="360" w:lineRule="auto"/>
-        <w:jc w:val="both"/>
-        <w:rPr>
-          <w:rFonts w:ascii="Times New Roman" w:hAnsi="Times New Roman" w:cs="Times New Roman"/>
-        </w:rPr>
-      </w:pPr>
+        <w:pStyle w:val="ListParagraph"/>
+        <w:numPr>
+          <w:ilvl w:val="2"/>
+          <w:numId w:val="4"/>
+        </w:numPr>
+        <w:spacing w:line="360" w:lineRule="auto"/>
+        <w:jc w:val="both"/>
+        <w:rPr>
+          <w:rFonts w:ascii="Times New Roman" w:hAnsi="Times New Roman" w:cs="Times New Roman"/>
+        </w:rPr>
+      </w:pPr>
+      <w:proofErr w:type="spellStart"/>
       <w:r>
         <w:rPr>
           <w:rFonts w:ascii="Times New Roman" w:hAnsi="Times New Roman" w:cs="Times New Roman"/>
         </w:rPr>
         <w:lastRenderedPageBreak/>
-        <w:t xml:space="preserve">1.4.8 </w:t>
-      </w:r>
-      <w:proofErr w:type="spellStart"/>
-      <w:r>
-        <w:rPr>
-          <w:rFonts w:ascii="Times New Roman" w:hAnsi="Times New Roman" w:cs="Times New Roman"/>
-        </w:rPr>
         <w:t>Periksa</w:t>
       </w:r>
       <w:proofErr w:type="spellEnd"/>
@@ -3691,18 +3739,18 @@
         </w:rPr>
         <w:t>.</w:t>
       </w:r>
-    </w:p>
-    <w:p>
-      <w:pPr>
-        <w:pStyle w:val="NormalWeb"/>
-        <w:ind w:left="567"/>
-      </w:pPr>
       <w:r>
         <w:rPr>
           <w:noProof/>
         </w:rPr>
+        <w:t xml:space="preserve"> </w:t>
+      </w:r>
+      <w:r>
+        <w:rPr>
+          <w:noProof/>
+        </w:rPr>
         <w:drawing>
-          <wp:inline distT="0" distB="0" distL="0" distR="0" wp14:anchorId="52715FAB" wp14:editId="626FF611">
+          <wp:inline distT="0" distB="0" distL="0" distR="0" wp14:anchorId="6837649A" wp14:editId="08784C5A">
             <wp:extent cx="5731510" cy="2782570"/>
             <wp:effectExtent l="0" t="0" r="2540" b="0"/>
             <wp:docPr id="1253212875" name="Picture 16"/>
@@ -3755,137 +3803,45 @@
       <w:pPr>
         <w:pStyle w:val="ListParagraph"/>
         <w:numPr>
-          <w:ilvl w:val="0"/>
-          <w:numId w:val="1"/>
+          <w:ilvl w:val="2"/>
+          <w:numId w:val="4"/>
         </w:numPr>
         <w:spacing w:line="360" w:lineRule="auto"/>
-        <w:ind w:left="426" w:hanging="426"/>
-        <w:jc w:val="both"/>
-        <w:rPr>
-          <w:rFonts w:ascii="Times New Roman" w:hAnsi="Times New Roman" w:cs="Times New Roman"/>
-          <w:b/>
-          <w:bCs/>
-        </w:rPr>
-      </w:pPr>
-      <w:proofErr w:type="spellStart"/>
-      <w:r>
-        <w:rPr>
-          <w:rFonts w:ascii="Times New Roman" w:hAnsi="Times New Roman" w:cs="Times New Roman"/>
-          <w:b/>
-          <w:bCs/>
-        </w:rPr>
-        <w:t>Analisis</w:t>
-      </w:r>
-      <w:proofErr w:type="spellEnd"/>
-    </w:p>
-    <w:p>
-      <w:pPr>
-        <w:pStyle w:val="ListParagraph"/>
-        <w:spacing w:line="360" w:lineRule="auto"/>
-        <w:ind w:left="426"/>
-        <w:jc w:val="both"/>
-        <w:rPr>
-          <w:rFonts w:ascii="Times New Roman" w:hAnsi="Times New Roman" w:cs="Times New Roman"/>
-        </w:rPr>
-      </w:pPr>
-      <w:r>
-        <w:rPr>
-          <w:rFonts w:ascii="Times New Roman" w:hAnsi="Times New Roman" w:cs="Times New Roman"/>
-          <w:lang w:val="sv-SE"/>
-        </w:rPr>
-        <w:t xml:space="preserve">Pada praktikum ini, Git digunakan untuk mengelola perubahan pada project dan GitHub digunakan sebagai tempat penyimpanan repository secara online. Project berhasil dihubungkan ke repository acara11 dan dilakukan dua kali commit. Penggunaan git add, git commit, dan git push berhasil dilakukan sehingga perubahan project dapat tersimpan di GitHub. </w:t>
-      </w:r>
-      <w:proofErr w:type="gramStart"/>
-      <w:r>
-        <w:rPr>
-          <w:rFonts w:ascii="Times New Roman" w:hAnsi="Times New Roman" w:cs="Times New Roman"/>
-        </w:rPr>
-        <w:t>File .</w:t>
-      </w:r>
-      <w:proofErr w:type="spellStart"/>
-      <w:r>
-        <w:rPr>
-          <w:rFonts w:ascii="Times New Roman" w:hAnsi="Times New Roman" w:cs="Times New Roman"/>
-        </w:rPr>
-        <w:t>gitignore</w:t>
-      </w:r>
-      <w:proofErr w:type="spellEnd"/>
-      <w:proofErr w:type="gramEnd"/>
-      <w:r>
-        <w:rPr>
-          <w:rFonts w:ascii="Times New Roman" w:hAnsi="Times New Roman" w:cs="Times New Roman"/>
-        </w:rPr>
-        <w:t xml:space="preserve"> juga </w:t>
-      </w:r>
-      <w:proofErr w:type="spellStart"/>
-      <w:r>
-        <w:rPr>
-          <w:rFonts w:ascii="Times New Roman" w:hAnsi="Times New Roman" w:cs="Times New Roman"/>
-        </w:rPr>
-        <w:t>digunakan</w:t>
-      </w:r>
-      <w:proofErr w:type="spellEnd"/>
-      <w:r>
-        <w:rPr>
-          <w:rFonts w:ascii="Times New Roman" w:hAnsi="Times New Roman" w:cs="Times New Roman"/>
-        </w:rPr>
-        <w:t xml:space="preserve"> </w:t>
-      </w:r>
-      <w:proofErr w:type="spellStart"/>
-      <w:r>
-        <w:rPr>
-          <w:rFonts w:ascii="Times New Roman" w:hAnsi="Times New Roman" w:cs="Times New Roman"/>
-        </w:rPr>
-        <w:t>untuk</w:t>
-      </w:r>
-      <w:proofErr w:type="spellEnd"/>
-      <w:r>
-        <w:rPr>
-          <w:rFonts w:ascii="Times New Roman" w:hAnsi="Times New Roman" w:cs="Times New Roman"/>
-        </w:rPr>
-        <w:t xml:space="preserve"> </w:t>
-      </w:r>
-      <w:proofErr w:type="spellStart"/>
-      <w:r>
-        <w:rPr>
-          <w:rFonts w:ascii="Times New Roman" w:hAnsi="Times New Roman" w:cs="Times New Roman"/>
-        </w:rPr>
-        <w:t>mengatur</w:t>
-      </w:r>
-      <w:proofErr w:type="spellEnd"/>
-      <w:r>
-        <w:rPr>
-          <w:rFonts w:ascii="Times New Roman" w:hAnsi="Times New Roman" w:cs="Times New Roman"/>
-        </w:rPr>
-        <w:t xml:space="preserve"> file yang </w:t>
-      </w:r>
-      <w:proofErr w:type="spellStart"/>
-      <w:r>
-        <w:rPr>
-          <w:rFonts w:ascii="Times New Roman" w:hAnsi="Times New Roman" w:cs="Times New Roman"/>
-        </w:rPr>
-        <w:t>tidak</w:t>
-      </w:r>
-      <w:proofErr w:type="spellEnd"/>
-      <w:r>
-        <w:rPr>
-          <w:rFonts w:ascii="Times New Roman" w:hAnsi="Times New Roman" w:cs="Times New Roman"/>
-        </w:rPr>
-        <w:t xml:space="preserve"> </w:t>
-      </w:r>
-      <w:proofErr w:type="spellStart"/>
-      <w:r>
-        <w:rPr>
-          <w:rFonts w:ascii="Times New Roman" w:hAnsi="Times New Roman" w:cs="Times New Roman"/>
-        </w:rPr>
-        <w:t>perlu</w:t>
-      </w:r>
-      <w:proofErr w:type="spellEnd"/>
-      <w:r>
-        <w:rPr>
-          <w:rFonts w:ascii="Times New Roman" w:hAnsi="Times New Roman" w:cs="Times New Roman"/>
-        </w:rPr>
-        <w:t xml:space="preserve"> di-upload.</w:t>
+        <w:jc w:val="both"/>
+        <w:rPr>
+          <w:rFonts w:ascii="Times New Roman" w:hAnsi="Times New Roman" w:cs="Times New Roman"/>
+        </w:rPr>
+      </w:pPr>
+      <w:r>
+        <w:rPr>
+          <w:rFonts w:ascii="Times New Roman" w:hAnsi="Times New Roman" w:cs="Times New Roman"/>
+        </w:rPr>
+        <w:t>Link GitHub</w:t>
+      </w:r>
+    </w:p>
+    <w:p>
+      <w:pPr>
+        <w:pStyle w:val="ListParagraph"/>
+        <w:spacing w:line="360" w:lineRule="auto"/>
+        <w:jc w:val="both"/>
+        <w:rPr>
+          <w:rFonts w:ascii="Times New Roman" w:hAnsi="Times New Roman" w:cs="Times New Roman"/>
+        </w:rPr>
+      </w:pPr>
+      <w:hyperlink r:id="rId14" w:history="1">
+        <w:r>
+          <w:rPr>
+            <w:rStyle w:val="Hyperlink"/>
+            <w:rFonts w:ascii="Times New Roman" w:hAnsi="Times New Roman" w:cs="Times New Roman"/>
+          </w:rPr>
+          <w:t>https://github.com/nindiatri/acara11.git</w:t>
+        </w:r>
+      </w:hyperlink>
+      <w:r>
+        <w:rPr>
+          <w:rFonts w:ascii="Times New Roman" w:hAnsi="Times New Roman" w:cs="Times New Roman"/>
+        </w:rPr>
+        <w:t xml:space="preserve"> </w:t>
       </w:r>
     </w:p>
     <w:p>
@@ -3904,12 +3860,147 @@
           <w:bCs/>
         </w:rPr>
       </w:pPr>
+      <w:proofErr w:type="spellStart"/>
       <w:r>
         <w:rPr>
           <w:rFonts w:ascii="Times New Roman" w:hAnsi="Times New Roman" w:cs="Times New Roman"/>
           <w:b/>
           <w:bCs/>
         </w:rPr>
+        <w:t>Analisis</w:t>
+      </w:r>
+      <w:proofErr w:type="spellEnd"/>
+    </w:p>
+    <w:p>
+      <w:pPr>
+        <w:pStyle w:val="ListParagraph"/>
+        <w:spacing w:line="360" w:lineRule="auto"/>
+        <w:ind w:left="426"/>
+        <w:jc w:val="both"/>
+        <w:rPr>
+          <w:rFonts w:ascii="Times New Roman" w:hAnsi="Times New Roman" w:cs="Times New Roman"/>
+        </w:rPr>
+      </w:pPr>
+      <w:r>
+        <w:rPr>
+          <w:rFonts w:ascii="Times New Roman" w:hAnsi="Times New Roman" w:cs="Times New Roman"/>
+          <w:lang w:val="sv-SE"/>
+        </w:rPr>
+        <w:t xml:space="preserve">Pada praktikum ini, Git digunakan untuk mengelola perubahan pada project dan GitHub digunakan sebagai tempat penyimpanan repository secara online. Project berhasil dihubungkan ke repository acara11 dan dilakukan dua kali commit. Penggunaan git add, git commit, dan git push berhasil dilakukan sehingga perubahan project dapat tersimpan di GitHub. </w:t>
+      </w:r>
+      <w:r>
+        <w:rPr>
+          <w:rFonts w:ascii="Times New Roman" w:hAnsi="Times New Roman" w:cs="Times New Roman"/>
+        </w:rPr>
+        <w:t>File .</w:t>
+      </w:r>
+      <w:proofErr w:type="spellStart"/>
+      <w:r>
+        <w:rPr>
+          <w:rFonts w:ascii="Times New Roman" w:hAnsi="Times New Roman" w:cs="Times New Roman"/>
+        </w:rPr>
+        <w:t>gitignore</w:t>
+      </w:r>
+      <w:proofErr w:type="spellEnd"/>
+      <w:r>
+        <w:rPr>
+          <w:rFonts w:ascii="Times New Roman" w:hAnsi="Times New Roman" w:cs="Times New Roman"/>
+        </w:rPr>
+        <w:t xml:space="preserve"> juga </w:t>
+      </w:r>
+      <w:proofErr w:type="spellStart"/>
+      <w:r>
+        <w:rPr>
+          <w:rFonts w:ascii="Times New Roman" w:hAnsi="Times New Roman" w:cs="Times New Roman"/>
+        </w:rPr>
+        <w:t>digunakan</w:t>
+      </w:r>
+      <w:proofErr w:type="spellEnd"/>
+      <w:r>
+        <w:rPr>
+          <w:rFonts w:ascii="Times New Roman" w:hAnsi="Times New Roman" w:cs="Times New Roman"/>
+        </w:rPr>
+        <w:t xml:space="preserve"> </w:t>
+      </w:r>
+      <w:proofErr w:type="spellStart"/>
+      <w:r>
+        <w:rPr>
+          <w:rFonts w:ascii="Times New Roman" w:hAnsi="Times New Roman" w:cs="Times New Roman"/>
+        </w:rPr>
+        <w:t>untuk</w:t>
+      </w:r>
+      <w:proofErr w:type="spellEnd"/>
+      <w:r>
+        <w:rPr>
+          <w:rFonts w:ascii="Times New Roman" w:hAnsi="Times New Roman" w:cs="Times New Roman"/>
+        </w:rPr>
+        <w:t xml:space="preserve"> </w:t>
+      </w:r>
+      <w:proofErr w:type="spellStart"/>
+      <w:r>
+        <w:rPr>
+          <w:rFonts w:ascii="Times New Roman" w:hAnsi="Times New Roman" w:cs="Times New Roman"/>
+        </w:rPr>
+        <w:t>mengatur</w:t>
+      </w:r>
+      <w:proofErr w:type="spellEnd"/>
+      <w:r>
+        <w:rPr>
+          <w:rFonts w:ascii="Times New Roman" w:hAnsi="Times New Roman" w:cs="Times New Roman"/>
+        </w:rPr>
+        <w:t xml:space="preserve"> file yang </w:t>
+      </w:r>
+      <w:proofErr w:type="spellStart"/>
+      <w:r>
+        <w:rPr>
+          <w:rFonts w:ascii="Times New Roman" w:hAnsi="Times New Roman" w:cs="Times New Roman"/>
+        </w:rPr>
+        <w:t>tidak</w:t>
+      </w:r>
+      <w:proofErr w:type="spellEnd"/>
+      <w:r>
+        <w:rPr>
+          <w:rFonts w:ascii="Times New Roman" w:hAnsi="Times New Roman" w:cs="Times New Roman"/>
+        </w:rPr>
+        <w:t xml:space="preserve"> </w:t>
+      </w:r>
+      <w:proofErr w:type="spellStart"/>
+      <w:r>
+        <w:rPr>
+          <w:rFonts w:ascii="Times New Roman" w:hAnsi="Times New Roman" w:cs="Times New Roman"/>
+        </w:rPr>
+        <w:t>perlu</w:t>
+      </w:r>
+      <w:proofErr w:type="spellEnd"/>
+      <w:r>
+        <w:rPr>
+          <w:rFonts w:ascii="Times New Roman" w:hAnsi="Times New Roman" w:cs="Times New Roman"/>
+        </w:rPr>
+        <w:t xml:space="preserve"> di-upload.</w:t>
+      </w:r>
+    </w:p>
+    <w:p>
+      <w:pPr>
+        <w:pStyle w:val="ListParagraph"/>
+        <w:numPr>
+          <w:ilvl w:val="0"/>
+          <w:numId w:val="1"/>
+        </w:numPr>
+        <w:spacing w:line="360" w:lineRule="auto"/>
+        <w:ind w:left="426" w:hanging="426"/>
+        <w:jc w:val="both"/>
+        <w:rPr>
+          <w:rFonts w:ascii="Times New Roman" w:hAnsi="Times New Roman" w:cs="Times New Roman"/>
+          <w:b/>
+          <w:bCs/>
+        </w:rPr>
+      </w:pPr>
+      <w:r>
+        <w:rPr>
+          <w:rFonts w:ascii="Times New Roman" w:hAnsi="Times New Roman" w:cs="Times New Roman"/>
+          <w:b/>
+          <w:bCs/>
+        </w:rPr>
         <w:t>Kesimpulan</w:t>
       </w:r>
     </w:p>
@@ -4024,28 +4115,7 @@
         <w:rPr>
           <w:rFonts w:ascii="Times New Roman" w:hAnsi="Times New Roman" w:cs="Times New Roman"/>
         </w:rPr>
-        <w:t xml:space="preserve"> minimal dua </w:t>
-      </w:r>
-      <w:proofErr w:type="gramStart"/>
-      <w:r>
-        <w:rPr>
-          <w:rFonts w:ascii="Times New Roman" w:hAnsi="Times New Roman" w:cs="Times New Roman"/>
-        </w:rPr>
-        <w:t>commit</w:t>
-      </w:r>
-      <w:proofErr w:type="gramEnd"/>
-      <w:r>
-        <w:rPr>
-          <w:rFonts w:ascii="Times New Roman" w:hAnsi="Times New Roman" w:cs="Times New Roman"/>
-        </w:rPr>
-        <w:t xml:space="preserve"> dan </w:t>
-      </w:r>
-      <w:proofErr w:type="gramStart"/>
-      <w:r>
-        <w:rPr>
-          <w:rFonts w:ascii="Times New Roman" w:hAnsi="Times New Roman" w:cs="Times New Roman"/>
-        </w:rPr>
-        <w:t>file .</w:t>
+        <w:t xml:space="preserve"> minimal dua commit dan file .</w:t>
       </w:r>
       <w:proofErr w:type="spellStart"/>
       <w:r>
@@ -4055,7 +4125,6 @@
         <w:t>gitignore</w:t>
       </w:r>
       <w:proofErr w:type="spellEnd"/>
-      <w:proofErr w:type="gramEnd"/>
       <w:r>
         <w:rPr>
           <w:rFonts w:ascii="Times New Roman" w:hAnsi="Times New Roman" w:cs="Times New Roman"/>
@@ -5902,6 +5971,29 @@
       <w:lang w:eastAsia="en-ID"/>
     </w:rPr>
   </w:style>
+  <w:style w:type="character" w:styleId="Hyperlink">
+    <w:name w:val="Hyperlink"/>
+    <w:basedOn w:val="DefaultParagraphFont"/>
+    <w:uiPriority w:val="99"/>
+    <w:unhideWhenUsed/>
+    <w:rsid w:val="00BE0EA9"/>
+    <w:rPr>
+      <w:color w:val="0563C1" w:themeColor="hyperlink"/>
+      <w:u w:val="single"/>
+    </w:rPr>
+  </w:style>
+  <w:style w:type="character" w:styleId="UnresolvedMention">
+    <w:name w:val="Unresolved Mention"/>
+    <w:basedOn w:val="DefaultParagraphFont"/>
+    <w:uiPriority w:val="99"/>
+    <w:semiHidden/>
+    <w:unhideWhenUsed/>
+    <w:rsid w:val="00BE0EA9"/>
+    <w:rPr>
+      <w:color w:val="605E5C"/>
+      <w:shd w:val="clear" w:color="auto" w:fill="E1DFDD"/>
+    </w:rPr>
+  </w:style>
 </w:styles>
 </file>
 

</xml_diff>